<commit_message>
POO S11 (Excepciones): profundizacion rigurosa (Throwable, checked/unchecked, throw/throws/finally, propias)
</commit_message>
<xml_diff>
--- a/11-week/optional-activity/pdf/Actividad-Semana11.docx
+++ b/11-week/optional-activity/pdf/Actividad-Semana11.docx
@@ -31,7 +31,7 @@
           <w:sz w:val="22"/>
           <w:szCs w:val="22"/>
         </w:rPr>
-        <w:t xml:space="preserve">Programación y Diseño Orientado a Objetos · Semana 11 · Programa robusto con manejo de errores</w:t>
+        <w:t xml:space="preserve">Programación y Diseño Orientado a Objetos · Semana 11 · Programa robusto con manejo de excepciones</w:t>
       </w:r>
     </w:p>
     <w:tbl>
@@ -430,7 +430,7 @@
           <w:sz w:val="22"/>
           <w:szCs w:val="22"/>
         </w:rPr>
-        <w:t xml:space="preserve">Manejar errores con try/catch.</w:t>
+        <w:t xml:space="preserve">Manejar varios tipos de error con try/catch.</w:t>
       </w:r>
     </w:p>
     <w:p>
@@ -454,7 +454,7 @@
           <w:sz w:val="22"/>
           <w:szCs w:val="22"/>
         </w:rPr>
-        <w:t xml:space="preserve">Lanzar una excepción propia ante una regla violada.</w:t>
+        <w:t xml:space="preserve">Lanzar una excepción personalizada ante una regla violada.</w:t>
       </w:r>
     </w:p>
     <w:p>
@@ -478,7 +478,7 @@
           <w:sz w:val="22"/>
           <w:szCs w:val="22"/>
         </w:rPr>
-        <w:t xml:space="preserve">Usar finally para un mensaje de cierre.</w:t>
+        <w:t xml:space="preserve">Usar finally o try-with-resources para la limpieza.</w:t>
       </w:r>
     </w:p>
     <w:p>
@@ -521,7 +521,7 @@
           <w:sz w:val="22"/>
           <w:szCs w:val="22"/>
         </w:rPr>
-        <w:t xml:space="preserve">Crea una clase </w:t>
+        <w:t xml:space="preserve">Crea </w:t>
       </w:r>
       <w:r>
         <w:rPr>
@@ -530,52 +530,16 @@
           <w:sz w:val="22"/>
           <w:szCs w:val="22"/>
         </w:rPr>
-        <w:t xml:space="preserve">Cuenta</w:t>
-      </w:r>
-      <w:r>
-        <w:rPr>
-          <w:rFonts w:ascii="Times New Roman" w:hAnsi="Times New Roman" w:cs="Times New Roman"/>
-          <w:color w:val="000000"/>
-          <w:sz w:val="22"/>
-          <w:szCs w:val="22"/>
-        </w:rPr>
-        <w:t xml:space="preserve"> con </w:t>
-      </w:r>
-      <w:r>
-        <w:rPr>
-          <w:rFonts w:ascii="Consolas" w:hAnsi="Consolas" w:cs="Consolas"/>
-          <w:color w:val="000000"/>
-          <w:sz w:val="22"/>
-          <w:szCs w:val="22"/>
-        </w:rPr>
-        <w:t xml:space="preserve">retirar(double)</w:t>
-      </w:r>
-      <w:r>
-        <w:rPr>
-          <w:rFonts w:ascii="Times New Roman" w:hAnsi="Times New Roman" w:cs="Times New Roman"/>
-          <w:color w:val="000000"/>
-          <w:sz w:val="22"/>
-          <w:szCs w:val="22"/>
-        </w:rPr>
-        <w:t xml:space="preserve"> que lance </w:t>
-      </w:r>
-      <w:r>
-        <w:rPr>
-          <w:rFonts w:ascii="Consolas" w:hAnsi="Consolas" w:cs="Consolas"/>
-          <w:color w:val="000000"/>
-          <w:sz w:val="22"/>
-          <w:szCs w:val="22"/>
-        </w:rPr>
-        <w:t xml:space="preserve">SaldoInsuficienteException</w:t>
-      </w:r>
-      <w:r>
-        <w:rPr>
-          <w:rFonts w:ascii="Times New Roman" w:hAnsi="Times New Roman" w:cs="Times New Roman"/>
-          <w:color w:val="000000"/>
-          <w:sz w:val="22"/>
-          <w:szCs w:val="22"/>
-        </w:rPr>
-        <w:t xml:space="preserve"> (propia) si el monto supera el saldo.</w:t>
+        <w:t xml:space="preserve">SaldoInsuficienteException extends RuntimeException</w:t>
+      </w:r>
+      <w:r>
+        <w:rPr>
+          <w:rFonts w:ascii="Times New Roman" w:hAnsi="Times New Roman" w:cs="Times New Roman"/>
+          <w:color w:val="000000"/>
+          <w:sz w:val="22"/>
+          <w:szCs w:val="22"/>
+        </w:rPr>
+        <w:t xml:space="preserve">.</w:t>
       </w:r>
     </w:p>
     <w:p>
@@ -599,7 +563,7 @@
           <w:sz w:val="22"/>
           <w:szCs w:val="22"/>
         </w:rPr>
-        <w:t xml:space="preserve">En </w:t>
+        <w:t xml:space="preserve">En una clase </w:t>
       </w:r>
       <w:r>
         <w:rPr>
@@ -608,16 +572,70 @@
           <w:sz w:val="22"/>
           <w:szCs w:val="22"/>
         </w:rPr>
-        <w:t xml:space="preserve">main</w:t>
-      </w:r>
-      <w:r>
-        <w:rPr>
-          <w:rFonts w:ascii="Times New Roman" w:hAnsi="Times New Roman" w:cs="Times New Roman"/>
-          <w:color w:val="000000"/>
-          <w:sz w:val="22"/>
-          <w:szCs w:val="22"/>
-        </w:rPr>
-        <w:t xml:space="preserve">, pide montos al usuario y maneja con try/catch: entrada no numérica y saldo insuficiente.</w:t>
+        <w:t xml:space="preserve">Cuenta</w:t>
+      </w:r>
+      <w:r>
+        <w:rPr>
+          <w:rFonts w:ascii="Times New Roman" w:hAnsi="Times New Roman" w:cs="Times New Roman"/>
+          <w:color w:val="000000"/>
+          <w:sz w:val="22"/>
+          <w:szCs w:val="22"/>
+        </w:rPr>
+        <w:t xml:space="preserve">, implementa </w:t>
+      </w:r>
+      <w:r>
+        <w:rPr>
+          <w:rFonts w:ascii="Consolas" w:hAnsi="Consolas" w:cs="Consolas"/>
+          <w:color w:val="000000"/>
+          <w:sz w:val="22"/>
+          <w:szCs w:val="22"/>
+        </w:rPr>
+        <w:t xml:space="preserve">retirar(double)</w:t>
+      </w:r>
+      <w:r>
+        <w:rPr>
+          <w:rFonts w:ascii="Times New Roman" w:hAnsi="Times New Roman" w:cs="Times New Roman"/>
+          <w:color w:val="000000"/>
+          <w:sz w:val="22"/>
+          <w:szCs w:val="22"/>
+        </w:rPr>
+        <w:t xml:space="preserve"> que lance </w:t>
+      </w:r>
+      <w:r>
+        <w:rPr>
+          <w:rFonts w:ascii="Consolas" w:hAnsi="Consolas" w:cs="Consolas"/>
+          <w:color w:val="000000"/>
+          <w:sz w:val="22"/>
+          <w:szCs w:val="22"/>
+        </w:rPr>
+        <w:t xml:space="preserve">IllegalArgumentException</w:t>
+      </w:r>
+      <w:r>
+        <w:rPr>
+          <w:rFonts w:ascii="Times New Roman" w:hAnsi="Times New Roman" w:cs="Times New Roman"/>
+          <w:color w:val="000000"/>
+          <w:sz w:val="22"/>
+          <w:szCs w:val="22"/>
+        </w:rPr>
+        <w:t xml:space="preserve"> si el monto ≤ 0 y </w:t>
+      </w:r>
+      <w:r>
+        <w:rPr>
+          <w:rFonts w:ascii="Consolas" w:hAnsi="Consolas" w:cs="Consolas"/>
+          <w:color w:val="000000"/>
+          <w:sz w:val="22"/>
+          <w:szCs w:val="22"/>
+        </w:rPr>
+        <w:t xml:space="preserve">SaldoInsuficienteException</w:t>
+      </w:r>
+      <w:r>
+        <w:rPr>
+          <w:rFonts w:ascii="Times New Roman" w:hAnsi="Times New Roman" w:cs="Times New Roman"/>
+          <w:color w:val="000000"/>
+          <w:sz w:val="22"/>
+          <w:szCs w:val="22"/>
+        </w:rPr>
+        <w:t xml:space="preserve"> si supera el saldo.</w:t>
       </w:r>
     </w:p>
     <w:p>
@@ -641,7 +659,7 @@
           <w:sz w:val="22"/>
           <w:szCs w:val="22"/>
         </w:rPr>
-        <w:t xml:space="preserve">Usa </w:t>
+        <w:t xml:space="preserve">En </w:t>
       </w:r>
       <w:r>
         <w:rPr>
@@ -650,16 +668,72 @@
           <w:sz w:val="22"/>
           <w:szCs w:val="22"/>
         </w:rPr>
-        <w:t xml:space="preserve">finally</w:t>
-      </w:r>
-      <w:r>
-        <w:rPr>
-          <w:rFonts w:ascii="Times New Roman" w:hAnsi="Times New Roman" w:cs="Times New Roman"/>
-          <w:color w:val="000000"/>
-          <w:sz w:val="22"/>
-          <w:szCs w:val="22"/>
-        </w:rPr>
-        <w:t xml:space="preserve"> para imprimir el saldo final siempre.</w:t>
+        <w:t xml:space="preserve">Main</w:t>
+      </w:r>
+      <w:r>
+        <w:rPr>
+          <w:rFonts w:ascii="Times New Roman" w:hAnsi="Times New Roman" w:cs="Times New Roman"/>
+          <w:color w:val="000000"/>
+          <w:sz w:val="22"/>
+          <w:szCs w:val="22"/>
+        </w:rPr>
+        <w:t xml:space="preserve">, pide montos al usuario en un bucle y maneja con try/catch: </w:t>
+      </w:r>
+      <w:r>
+        <w:rPr>
+          <w:rFonts w:ascii="Times New Roman" w:hAnsi="Times New Roman" w:cs="Times New Roman"/>
+          <w:b/>
+          <w:color w:val="000000"/>
+          <w:sz w:val="22"/>
+          <w:szCs w:val="22"/>
+        </w:rPr>
+        <w:t xml:space="preserve">entrada no numérica</w:t>
+      </w:r>
+      <w:r>
+        <w:rPr>
+          <w:rFonts w:ascii="Times New Roman" w:hAnsi="Times New Roman" w:cs="Times New Roman"/>
+          <w:color w:val="000000"/>
+          <w:sz w:val="22"/>
+          <w:szCs w:val="22"/>
+        </w:rPr>
+        <w:t xml:space="preserve"> (</w:t>
+      </w:r>
+      <w:r>
+        <w:rPr>
+          <w:rFonts w:ascii="Consolas" w:hAnsi="Consolas" w:cs="Consolas"/>
+          <w:color w:val="000000"/>
+          <w:sz w:val="22"/>
+          <w:szCs w:val="22"/>
+        </w:rPr>
+        <w:t xml:space="preserve">NumberFormatException</w:t>
+      </w:r>
+      <w:r>
+        <w:rPr>
+          <w:rFonts w:ascii="Times New Roman" w:hAnsi="Times New Roman" w:cs="Times New Roman"/>
+          <w:color w:val="000000"/>
+          <w:sz w:val="22"/>
+          <w:szCs w:val="22"/>
+        </w:rPr>
+        <w:t xml:space="preserve">) y </w:t>
+      </w:r>
+      <w:r>
+        <w:rPr>
+          <w:rFonts w:ascii="Times New Roman" w:hAnsi="Times New Roman" w:cs="Times New Roman"/>
+          <w:b/>
+          <w:color w:val="000000"/>
+          <w:sz w:val="22"/>
+          <w:szCs w:val="22"/>
+        </w:rPr>
+        <w:t xml:space="preserve">saldo insuficiente</w:t>
+      </w:r>
+      <w:r>
+        <w:rPr>
+          <w:rFonts w:ascii="Times New Roman" w:hAnsi="Times New Roman" w:cs="Times New Roman"/>
+          <w:color w:val="000000"/>
+          <w:sz w:val="22"/>
+          <w:szCs w:val="22"/>
+        </w:rPr>
+        <w:t xml:space="preserve">.</w:t>
       </w:r>
     </w:p>
     <w:p>
@@ -683,7 +757,87 @@
           <w:sz w:val="22"/>
           <w:szCs w:val="22"/>
         </w:rPr>
-        <w:t xml:space="preserve">Prueba con casos válidos e inválidos.</w:t>
+        <w:t xml:space="preserve">Usa </w:t>
+      </w:r>
+      <w:r>
+        <w:rPr>
+          <w:rFonts w:ascii="Consolas" w:hAnsi="Consolas" w:cs="Consolas"/>
+          <w:color w:val="000000"/>
+          <w:sz w:val="22"/>
+          <w:szCs w:val="22"/>
+        </w:rPr>
+        <w:t xml:space="preserve">finally</w:t>
+      </w:r>
+      <w:r>
+        <w:rPr>
+          <w:rFonts w:ascii="Times New Roman" w:hAnsi="Times New Roman" w:cs="Times New Roman"/>
+          <w:color w:val="000000"/>
+          <w:sz w:val="22"/>
+          <w:szCs w:val="22"/>
+        </w:rPr>
+        <w:t xml:space="preserve"> para imprimir </w:t>
+      </w:r>
+      <w:r>
+        <w:rPr>
+          <w:rFonts w:ascii="Times New Roman" w:hAnsi="Times New Roman" w:cs="Times New Roman"/>
+          <w:b/>
+          <w:color w:val="000000"/>
+          <w:sz w:val="22"/>
+          <w:szCs w:val="22"/>
+        </w:rPr>
+        <w:t xml:space="preserve">siempre</w:t>
+      </w:r>
+      <w:r>
+        <w:rPr>
+          <w:rFonts w:ascii="Times New Roman" w:hAnsi="Times New Roman" w:cs="Times New Roman"/>
+          <w:color w:val="000000"/>
+          <w:sz w:val="22"/>
+          <w:szCs w:val="22"/>
+        </w:rPr>
+        <w:t xml:space="preserve"> el saldo tras cada intento.</w:t>
+      </w:r>
+    </w:p>
+    <w:p>
+      <w:pPr>
+        <w:spacing w:after="120" w:line="276" w:lineRule="auto"/>
+        <w:ind w:left="454" w:hanging="284"/>
+      </w:pPr>
+      <w:r>
+        <w:rPr>
+          <w:rFonts w:ascii="Times New Roman" w:hAnsi="Times New Roman" w:cs="Times New Roman"/>
+          <w:color w:val="000000"/>
+          <w:sz w:val="22"/>
+          <w:szCs w:val="22"/>
+        </w:rPr>
+        <w:t xml:space="preserve">5.	</w:t>
+      </w:r>
+      <w:r>
+        <w:rPr>
+          <w:rFonts w:ascii="Times New Roman" w:hAnsi="Times New Roman" w:cs="Times New Roman"/>
+          <w:color w:val="000000"/>
+          <w:sz w:val="22"/>
+          <w:szCs w:val="22"/>
+        </w:rPr>
+        <w:t xml:space="preserve">(Reto +) Registra las operaciones en un archivo con </w:t>
+      </w:r>
+      <w:r>
+        <w:rPr>
+          <w:rFonts w:ascii="Times New Roman" w:hAnsi="Times New Roman" w:cs="Times New Roman"/>
+          <w:b/>
+          <w:color w:val="000000"/>
+          <w:sz w:val="22"/>
+          <w:szCs w:val="22"/>
+        </w:rPr>
+        <w:t xml:space="preserve">try-with-resources</w:t>
+      </w:r>
+      <w:r>
+        <w:rPr>
+          <w:rFonts w:ascii="Times New Roman" w:hAnsi="Times New Roman" w:cs="Times New Roman"/>
+          <w:color w:val="000000"/>
+          <w:sz w:val="22"/>
+          <w:szCs w:val="22"/>
+        </w:rPr>
+        <w:t xml:space="preserve">.</w:t>
       </w:r>
     </w:p>
     <w:p>
@@ -726,7 +880,7 @@
           <w:sz w:val="22"/>
           <w:szCs w:val="22"/>
         </w:rPr>
-        <w:t xml:space="preserve">Excepción personalizada creada y lanzada.</w:t>
+        <w:t xml:space="preserve">Excepción personalizada creada y lanzada con mensaje útil.</w:t>
       </w:r>
     </w:p>
     <w:p>
@@ -750,7 +904,7 @@
           <w:sz w:val="22"/>
           <w:szCs w:val="22"/>
         </w:rPr>
-        <w:t xml:space="preserve">try/catch para al menos dos tipos de error.</w:t>
+        <w:t xml:space="preserve">try/catch para al menos dos tipos de error, ordenados correctamente.</w:t>
       </w:r>
     </w:p>
     <w:p>
@@ -769,12 +923,45 @@
       </w:r>
       <w:r>
         <w:rPr>
-          <w:rFonts w:ascii="Times New Roman" w:hAnsi="Times New Roman" w:cs="Times New Roman"/>
-          <w:color w:val="000000"/>
-          <w:sz w:val="22"/>
-          <w:szCs w:val="22"/>
-        </w:rPr>
-        <w:t xml:space="preserve">Bloque finally.</w:t>
+          <w:rFonts w:ascii="Consolas" w:hAnsi="Consolas" w:cs="Consolas"/>
+          <w:color w:val="000000"/>
+          <w:sz w:val="22"/>
+          <w:szCs w:val="22"/>
+        </w:rPr>
+        <w:t xml:space="preserve">finally</w:t>
+      </w:r>
+      <w:r>
+        <w:rPr>
+          <w:rFonts w:ascii="Times New Roman" w:hAnsi="Times New Roman" w:cs="Times New Roman"/>
+          <w:color w:val="000000"/>
+          <w:sz w:val="22"/>
+          <w:szCs w:val="22"/>
+        </w:rPr>
+        <w:t xml:space="preserve"> (o try-with-resources) para limpieza/registro.</w:t>
+      </w:r>
+    </w:p>
+    <w:p>
+      <w:pPr>
+        <w:spacing w:after="120" w:line="276" w:lineRule="auto"/>
+        <w:ind w:left="454" w:hanging="284"/>
+      </w:pPr>
+      <w:r>
+        <w:rPr>
+          <w:rFonts w:ascii="Times New Roman" w:hAnsi="Times New Roman" w:cs="Times New Roman"/>
+          <w:color w:val="000000"/>
+          <w:sz w:val="22"/>
+          <w:szCs w:val="22"/>
+        </w:rPr>
+        <w:t xml:space="preserve">•	</w:t>
+      </w:r>
+      <w:r>
+        <w:rPr>
+          <w:rFonts w:ascii="Times New Roman" w:hAnsi="Times New Roman" w:cs="Times New Roman"/>
+          <w:color w:val="000000"/>
+          <w:sz w:val="22"/>
+          <w:szCs w:val="22"/>
+        </w:rPr>
+        <w:t xml:space="preserve">Casos de prueba válidos e inválidos documentados.</w:t>
       </w:r>
     </w:p>
     <w:p>
@@ -877,7 +1064,7 @@
           <w:sz w:val="18"/>
           <w:szCs w:val="18"/>
         </w:rPr>
-        <w:t xml:space="preserve">  README.md   -&gt; casos de prueba + resultados</w:t>
+        <w:t xml:space="preserve">  README.md   -&gt; casos de prueba + salida</w:t>
       </w:r>
     </w:p>
     <w:p>
@@ -917,7 +1104,7 @@
           <w:sz w:val="22"/>
           <w:szCs w:val="22"/>
         </w:rPr>
-        <w:t xml:space="preserve">Crea el repo público con ese nombre.</w:t>
+        <w:t xml:space="preserve">Crea el repositorio público con ese nombre.</w:t>
       </w:r>
     </w:p>
     <w:p>
@@ -965,7 +1152,7 @@
           <w:sz w:val="22"/>
           <w:szCs w:val="22"/>
         </w:rPr>
-        <w:t xml:space="preserve">Comparte el enlace por el canal indicado.</w:t>
+        <w:t xml:space="preserve">Comparte el enlace por el canal indicado por el docente.</w:t>
       </w:r>
     </w:p>
     <w:p>
@@ -1048,7 +1235,7 @@
                 <w:sz w:val="20"/>
                 <w:szCs w:val="20"/>
               </w:rPr>
-              <w:t xml:space="preserve">Excelente</w:t>
+              <w:t xml:space="preserve">Excelente (100%)</w:t>
             </w:r>
           </w:p>
         </w:tc>
@@ -1070,7 +1257,7 @@
                 <w:sz w:val="20"/>
                 <w:szCs w:val="20"/>
               </w:rPr>
-              <w:t xml:space="preserve">Aceptable</w:t>
+              <w:t xml:space="preserve">Aceptable (60%)</w:t>
             </w:r>
           </w:p>
         </w:tc>
@@ -1092,7 +1279,7 @@
                 <w:sz w:val="20"/>
                 <w:szCs w:val="20"/>
               </w:rPr>
-              <w:t xml:space="preserve">Por mejorar</w:t>
+              <w:t xml:space="preserve">Por mejorar (0%)</w:t>
             </w:r>
           </w:p>
         </w:tc>
@@ -1136,7 +1323,7 @@
                 <w:sz w:val="20"/>
                 <w:szCs w:val="20"/>
               </w:rPr>
-              <w:t xml:space="preserve">try/catch (2 tipos)</w:t>
+              <w:t xml:space="preserve">try/catch (2+ tipos, bien ordenados)</w:t>
             </w:r>
           </w:p>
         </w:tc>
@@ -1238,7 +1425,7 @@
                 <w:sz w:val="20"/>
                 <w:szCs w:val="20"/>
               </w:rPr>
-              <w:t xml:space="preserve">Excepción propia (throw)</w:t>
+              <w:t xml:space="preserve">Excepción propia (throw + mensaje)</w:t>
             </w:r>
           </w:p>
         </w:tc>
@@ -1318,7 +1505,7 @@
                 <w:sz w:val="20"/>
                 <w:szCs w:val="20"/>
               </w:rPr>
-              <w:t xml:space="preserve">35</w:t>
+              <w:t xml:space="preserve">30</w:t>
             </w:r>
           </w:p>
         </w:tc>
@@ -1340,7 +1527,7 @@
                 <w:sz w:val="20"/>
                 <w:szCs w:val="20"/>
               </w:rPr>
-              <w:t xml:space="preserve">finally</w:t>
+              <w:t xml:space="preserve">finally / try-with-resources</w:t>
             </w:r>
           </w:p>
         </w:tc>
@@ -1380,7 +1567,7 @@
                 <w:sz w:val="20"/>
                 <w:szCs w:val="20"/>
               </w:rPr>
-              <w:t xml:space="preserve">—</w:t>
+              <w:t xml:space="preserve">Parcial</w:t>
             </w:r>
           </w:p>
         </w:tc>
@@ -1420,7 +1607,7 @@
                 <w:sz w:val="20"/>
                 <w:szCs w:val="20"/>
               </w:rPr>
-              <w:t xml:space="preserve">20</w:t>
+              <w:t xml:space="preserve">25</w:t>
             </w:r>
           </w:p>
         </w:tc>
@@ -1442,7 +1629,7 @@
                 <w:sz w:val="20"/>
                 <w:szCs w:val="20"/>
               </w:rPr>
-              <w:t xml:space="preserve">README y repositorio</w:t>
+              <w:t xml:space="preserve">Casos de prueba + README</w:t>
             </w:r>
           </w:p>
         </w:tc>
@@ -1462,7 +1649,7 @@
                 <w:sz w:val="20"/>
                 <w:szCs w:val="20"/>
               </w:rPr>
-              <w:t xml:space="preserve">Ordenado</w:t>
+              <w:t xml:space="preserve">Claros</w:t>
             </w:r>
           </w:p>
         </w:tc>
@@ -1482,7 +1669,7 @@
                 <w:sz w:val="20"/>
                 <w:szCs w:val="20"/>
               </w:rPr>
-              <w:t xml:space="preserve">Aceptable</w:t>
+              <w:t xml:space="preserve">Aceptables</w:t>
             </w:r>
           </w:p>
         </w:tc>
@@ -1502,7 +1689,7 @@
                 <w:sz w:val="20"/>
                 <w:szCs w:val="20"/>
               </w:rPr>
-              <w:t xml:space="preserve">Deficiente</w:t>
+              <w:t xml:space="preserve">Deficientes</w:t>
             </w:r>
           </w:p>
         </w:tc>
@@ -1541,7 +1728,7 @@
           <w:sz w:val="21"/>
           <w:szCs w:val="21"/>
         </w:rPr>
-        <w:t xml:space="preserve">Nota: actividad formativa y opcional (sin nota en Moodle). La guía unificada de entrega estará en el Manual de Entrega de Actividades Opcionales (próximamente).</w:t>
+        <w:t xml:space="preserve">Nota: actividad formativa y opcional (sin nota en Moodle). La guía unificada para entregar todas las actividades opcionales, válida para todas las materias, estará en el Manual de Entrega de Actividades Opcionales (próximamente).</w:t>
       </w:r>
     </w:p>
     <w:sectPr>

</xml_diff>